<commit_message>
feat: add visual legal document designer
</commit_message>
<xml_diff>
--- a/DOC/Relatorio_Central_Juridica_2026-09-20_corrigido.docx
+++ b/DOC/Relatorio_Central_Juridica_2026-09-20_corrigido.docx
@@ -1,6 +1,6 @@
 
 <file path=word/document.xml><?xml version="1.0" encoding="utf-8"?>
-<w:document xmlns:w="http://schemas.openxmlformats.org/wordprocessingml/2006/main" xmlns:r="http://schemas.openxmlformats.org/officeDocument/2006/relationships" xmlns:mc="http://schemas.openxmlformats.org/markup-compatibility/2006" mc:Ignorable="w14 wp14">
+<w:document xmlns:ns1="http://schemas.openxmlformats.org/markup-compatibility/2006" xmlns:w="http://schemas.openxmlformats.org/wordprocessingml/2006/main" ns1:Ignorable="w14 wp14">
   <w:body>
     <w:p>
       <w:pPr>
@@ -15,7 +15,7 @@
         <w:pStyle w:val="Subtitle"/>
       </w:pPr>
       <w:r>
-        <w:t xml:space="preserve">Atualizado em 20/09/2026. Documento operacional sanitizado, sem credenciais, tokens, dados pessoais reais ou conteúdo de .env.</w:t>
+        <w:t xml:space="preserve">Atualizado em 21/09/2026. Documento operacional sanitizado, sem credenciais, tokens, dados pessoais reais ou conteúdo de .env.</w:t>
       </w:r>
     </w:p>
     <w:p>
@@ -1844,6 +1844,49 @@
     <w:p>
       <w:r>
         <w:t xml:space="preserve">Observação legal: a assinatura eletrônica interna registra evidências técnicas e trilha de auditoria, mas não equivale a certificado digital ICP-Brasil. Se esse nível for obrigatório, será necessária integração com provedor externo homologado.</w:t>
+      </w:r>
+    </w:p>
+    <w:p>
+      <w:pPr>
+        <w:pStyle w:val="Heading1"/>
+      </w:pPr>
+      <w:r>
+        <w:t>Atualização técnica - 21/09/2026</w:t>
+      </w:r>
+    </w:p>
+    <w:p>
+      <w:r>
+        <w:t>Editor visual de documentos: foi implementado o editor no-code para templates jurídicos em folha A4, com posicionamento em milímetros, arrasta-e-solta de elementos, múltiplas páginas e preservação de fidelidade entre criação, geração em PDF, assinatura e impressão.</w:t>
+      </w:r>
+    </w:p>
+    <w:p>
+      <w:r>
+        <w:t>Papel timbrado e fundo: o plano de fundo ocupa a página A4 inteira por padrão, possui opacidade configurável e agora pode ser enviado no próprio painel por upload com arrasta-e-solta, gravado como mídia pública controlada em uploads/legal-document-backgrounds/.</w:t>
+      </w:r>
+    </w:p>
+    <w:p>
+      <w:r>
+        <w:t>Assinaturas e testemunhas: o template visual permite posicionar a assinatura do cliente na última página e adicionar campos opcionais de testemunhas por ordem de signatário. Templates visuais milimétricos são gerados em PDF, evitando divergência de layout em DOCX.</w:t>
+      </w:r>
+    </w:p>
+    <w:p>
+      <w:r>
+        <w:t>Assinatura eletrônica desenhada: o formulário público passou a exigir assinatura real no canvas, com desfazer, borracha e limpar assinatura. Pontinhos, riscos mínimos ou rabiscos sem métricas suficientes são rejeitados.</w:t>
+      </w:r>
+    </w:p>
+    <w:p>
+      <w:r>
+        <w:t>Evidências: a imagem da assinatura é armazenada em área privada do módulo, com SHA-256 e métricas registradas no comprovante JSON e nos eventos append-only.</w:t>
+      </w:r>
+    </w:p>
+    <w:p>
+      <w:r>
+        <w:t>Validações locais executadas: LegalDocumentGeneratorTest, ElectronicSignatureTest, SignatureContentEncodingTest e build Vite passaram; a suíte completa anterior a este ajuste também passou com 222 testes aprovados e 2 ignorados esperados.</w:t>
+      </w:r>
+    </w:p>
+    <w:p>
+      <w:r>
+        <w:t>Pendências antes da entrega final: publicar o novo SHA no servidor correto, executar migration incremental das colunas de assinatura desenhada, limpar caches Laravel, validar a tela autenticada do editor visual no painel, gerar um PDF de teste com papel timbrado e repetir o fluxo real de assinatura com dados fictícios.</w:t>
       </w:r>
     </w:p>
     <w:sectPr>

</xml_diff>

<commit_message>
feat: improve visual document designer alignment controls
</commit_message>
<xml_diff>
--- a/DOC/Relatorio_Central_Juridica_2026-09-20_corrigido.docx
+++ b/DOC/Relatorio_Central_Juridica_2026-09-20_corrigido.docx
@@ -1893,6 +1893,106 @@
       <w:pgSz w:w="12240" w:h="15840"/>
       <w:pgMar w:top="1440" w:right="1440" w:bottom="1440" w:left="1440" w:header="720" w:footer="720" w:gutter="0"/>
     </w:sectPr>
+    <w:p>
+      <w:pPr>
+        <w:pStyle w:val="Heading1"/>
+      </w:pPr>
+      <w:r>
+        <w:t>Atualiza??o t?cnica - 21/09/2026 (editor visual)</w:t>
+      </w:r>
+    </w:p>
+    <w:p>
+      <w:r>
+        <w:t>Foram incorporados ajustes de usabilidade e precis?o no editor visual de documentos jur?dicos, mantendo gera??o em PDF para preservar a fidelidade entre cria??o, assinatura e impress?o.</w:t>
+      </w:r>
+    </w:p>
+    <w:p>
+      <w:r>
+        <w:t>Itens incorporados</w:t>
+      </w:r>
+    </w:p>
+    <w:p>
+      <w:pPr>
+        <w:ind w:left="720" w:hanging="360"/>
+      </w:pPr>
+      <w:r>
+        <w:t>? </w:t>
+      </w:r>
+      <w:r>
+        <w:t>Grade opcional com tamanho configur?vel em mil?metros e op??o de encaixe para alinhamento fino.</w:t>
+      </w:r>
+    </w:p>
+    <w:p>
+      <w:pPr>
+        <w:ind w:left="720" w:hanging="360"/>
+      </w:pPr>
+      <w:r>
+        <w:t>? </w:t>
+      </w:r>
+      <w:r>
+        <w:t>Controle opcional de margens A4 por lado, com modo livre para permitir ou bloquear posicionamento fora da ?rea ?til.</w:t>
+      </w:r>
+    </w:p>
+    <w:p>
+      <w:pPr>
+        <w:ind w:left="720" w:hanging="360"/>
+      </w:pPr>
+      <w:r>
+        <w:t>? </w:t>
+      </w:r>
+      <w:r>
+        <w:t>Interface reorganizada em cards para separar a??es, guias, papel timbrado, apar?ncia do fundo, p?gina A4 e propriedades do item selecionado.</w:t>
+      </w:r>
+    </w:p>
+    <w:p>
+      <w:pPr>
+        <w:ind w:left="720" w:hanging="360"/>
+      </w:pPr>
+      <w:r>
+        <w:t>? </w:t>
+      </w:r>
+      <w:r>
+        <w:t>Componente ?nico compartilhado entre cria??o de template e publica??o de nova vers?o, reduzindo diverg?ncia visual entre p?ginas.</w:t>
+      </w:r>
+    </w:p>
+    <w:p>
+      <w:pPr>
+        <w:ind w:left="720" w:hanging="360"/>
+      </w:pPr>
+      <w:r>
+        <w:t>? </w:t>
+      </w:r>
+      <w:r>
+        <w:t>Prefer?ncias de grade e margens salvas no JSON do template e normalizadas no backend antes da persist?ncia.</w:t>
+      </w:r>
+    </w:p>
+    <w:p>
+      <w:r>
+        <w:t>Valida??es registradas</w:t>
+      </w:r>
+    </w:p>
+    <w:p>
+      <w:pPr>
+        <w:ind w:left="720" w:hanging="360"/>
+      </w:pPr>
+      <w:r>
+        <w:t>? </w:t>
+      </w:r>
+      <w:r>
+        <w:t>LegalDocumentGeneratorTest aprovado com cobertura dos novos controles e persist?ncia das guias.</w:t>
+      </w:r>
+    </w:p>
+    <w:p>
+      <w:pPr>
+        <w:ind w:left="720" w:hanging="360"/>
+      </w:pPr>
+      <w:r>
+        <w:t>? </w:t>
+      </w:r>
+      <w:r>
+        <w:t>Cache de views e build Vite aprovados ap?s a altera??o.</w:t>
+      </w:r>
+    </w:p>
   </w:body>
 </w:document>
 </file>

</xml_diff>

<commit_message>
feat: keep visual signatures on final page
</commit_message>
<xml_diff>
--- a/DOC/Relatorio_Central_Juridica_2026-09-20_corrigido.docx
+++ b/DOC/Relatorio_Central_Juridica_2026-09-20_corrigido.docx
@@ -1980,6 +1980,95 @@
       </w:r>
       <w:r>
         <w:t>LegalDocumentGeneratorTest aprovado com cobertura dos novos controles e persist?ncia das guias.</w:t>
+      </w:r>
+    </w:p>
+    <w:p>
+      <w:pPr>
+        <w:ind w:left="720" w:hanging="360"/>
+      </w:pPr>
+      <w:r>
+        <w:t>? </w:t>
+      </w:r>
+      <w:r>
+        <w:t>Cache de views e build Vite aprovados ap?s a altera??o.</w:t>
+      </w:r>
+    </w:p>
+    <w:p>
+      <w:pPr>
+        <w:pStyle w:val="Heading1"/>
+      </w:pPr>
+      <w:r>
+        <w:t>Atualiza??o t?cnica - 21/09/2026 (p?ginas e assinaturas autom?ticas)</w:t>
+      </w:r>
+    </w:p>
+    <w:p>
+      <w:r>
+        <w:t>O editor visual foi ajustado para reduzir trabalho manual em documentos com mais de uma folha e evitar assinatura em p?gina incorreta.</w:t>
+      </w:r>
+    </w:p>
+    <w:p>
+      <w:r>
+        <w:t>Comportamento implementado</w:t>
+      </w:r>
+    </w:p>
+    <w:p>
+      <w:pPr>
+        <w:ind w:left="720" w:hanging="360"/>
+      </w:pPr>
+      <w:r>
+        <w:t>? </w:t>
+      </w:r>
+      <w:r>
+        <w:t>Ao adicionar nova p?gina, o sistema copia automaticamente o papel timbrado/fundo da p?gina atual, incluindo opacidade e encaixe.</w:t>
+      </w:r>
+    </w:p>
+    <w:p>
+      <w:pPr>
+        <w:ind w:left="720" w:hanging="360"/>
+      </w:pPr>
+      <w:r>
+        <w:t>? </w:t>
+      </w:r>
+      <w:r>
+        <w:t>Assinatura do cliente e campos de testemunhas s?o movidos automaticamente para a ?ltima folha, preservando X, Y, largura e altura em mil?metros.</w:t>
+      </w:r>
+    </w:p>
+    <w:p>
+      <w:pPr>
+        <w:ind w:left="720" w:hanging="360"/>
+      </w:pPr>
+      <w:r>
+        <w:t>? </w:t>
+      </w:r>
+      <w:r>
+        <w:t>Ao remover uma p?gina, campos de assinatura s?o preservados e reposicionados na nova ?ltima folha quando necess?rio.</w:t>
+      </w:r>
+    </w:p>
+    <w:p>
+      <w:pPr>
+        <w:ind w:left="720" w:hanging="360"/>
+      </w:pPr>
+      <w:r>
+        <w:t>? </w:t>
+      </w:r>
+      <w:r>
+        <w:t>A normaliza??o backend refor?a a regra para templates salvos manualmente por JSON, mantendo assinaturas sempre na ?ltima p?gina.</w:t>
+      </w:r>
+    </w:p>
+    <w:p>
+      <w:r>
+        <w:t>Valida??o registradas</w:t>
+      </w:r>
+    </w:p>
+    <w:p>
+      <w:pPr>
+        <w:ind w:left="720" w:hanging="360"/>
+      </w:pPr>
+      <w:r>
+        <w:t>? </w:t>
+      </w:r>
+      <w:r>
+        <w:t>LegalDocumentGeneratorTest aprovado com regress?o de preserva??o de posi??o das assinaturas na ?ltima p?gina.</w:t>
       </w:r>
     </w:p>
     <w:p>

</xml_diff>

<commit_message>
fix: allow signature requests from templates
</commit_message>
<xml_diff>
--- a/DOC/Relatorio_Central_Juridica_2026-09-20_corrigido.docx
+++ b/DOC/Relatorio_Central_Juridica_2026-09-20_corrigido.docx
@@ -1668,6 +1668,126 @@
         <w:t>Foi adicionado teste de regressão específico para a situação exibida no painel, garantindo que a falha não volte.</w:t>
       </w:r>
     </w:p>
+    <w:p>
+      <w:r>
+        <w:br w:type="page"/>
+      </w:r>
+    </w:p>
+    <w:p>
+      <w:pPr>
+        <w:pStyle w:val="Heading1"/>
+        <w:jc w:val="left"/>
+      </w:pPr>
+      <w:r>
+        <w:t>Atualização 2026-09-22 — Fluxo direto de modelo para assinatura</w:t>
+      </w:r>
+    </w:p>
+    <w:p>
+      <w:r>
+        <w:rPr>
+          <w:b/>
+        </w:rPr>
+        <w:t xml:space="preserve">Resumo: </w:t>
+      </w:r>
+      <w:r>
+        <w:t>a tela de envio para assinatura foi integrada diretamente ao Gerador de documentos. Agora o usuário pode escolher um modelo ativo, selecionar cliente/processo, gerar o PDF privado automaticamente e enviar o convite de assinatura sem anexar arquivo manualmente.</w:t>
+      </w:r>
+    </w:p>
+    <w:p>
+      <w:pPr>
+        <w:pStyle w:val="ListBullet"/>
+      </w:pPr>
+      <w:r>
+        <w:rPr>
+          <w:b/>
+        </w:rPr>
+        <w:t xml:space="preserve">Causa da dúvida do usuário: </w:t>
+      </w:r>
+      <w:r>
+        <w:t>a opção anterior listava apenas PDFs privados já cadastrados em Documentos; modelos ainda não gerados eram templates e, por isso, não apareciam na lista.</w:t>
+      </w:r>
+    </w:p>
+    <w:p>
+      <w:pPr>
+        <w:pStyle w:val="ListBullet"/>
+      </w:pPr>
+      <w:r>
+        <w:rPr>
+          <w:b/>
+        </w:rPr>
+        <w:t xml:space="preserve">Correção funcional: </w:t>
+      </w:r>
+      <w:r>
+        <w:t>foi adicionada a origem Gerar pelo modelo em /admin/signature-requests/create, com preview, escopo, versão e geração automática de PDF privado com SHA-256.</w:t>
+      </w:r>
+    </w:p>
+    <w:p>
+      <w:pPr>
+        <w:pStyle w:val="ListBullet"/>
+      </w:pPr>
+      <w:r>
+        <w:rPr>
+          <w:b/>
+        </w:rPr>
+        <w:t xml:space="preserve">Persistência e segurança: </w:t>
+      </w:r>
+      <w:r>
+        <w:t>o PDF gerado continua gravado em storage privado, vinculado ao cliente/processo e registrado em Documentos antes da criação da solicitação de assinatura.</w:t>
+      </w:r>
+    </w:p>
+    <w:p>
+      <w:pPr>
+        <w:pStyle w:val="ListBullet"/>
+      </w:pPr>
+      <w:r>
+        <w:rPr>
+          <w:b/>
+        </w:rPr>
+        <w:t xml:space="preserve">Experiência do usuário: </w:t>
+      </w:r>
+      <w:r>
+        <w:t>quando não existir PDF privado elegível, mas houver modelo ativo disponível, a tela inicia automaticamente em Gerar pelo modelo; Anexar PDF continua como alternativa.</w:t>
+      </w:r>
+    </w:p>
+    <w:p>
+      <w:pPr>
+        <w:pStyle w:val="ListBullet"/>
+      </w:pPr>
+      <w:r>
+        <w:rPr>
+          <w:b/>
+        </w:rPr>
+        <w:t xml:space="preserve">Validação automatizada: </w:t>
+      </w:r>
+      <w:r>
+        <w:t>foi adicionado teste de regressão cobrindo geração por template e envio da solicitação de assinatura com convite.</w:t>
+      </w:r>
+    </w:p>
+    <w:p>
+      <w:pPr>
+        <w:pStyle w:val="ListBullet"/>
+      </w:pPr>
+      <w:r>
+        <w:rPr>
+          <w:b/>
+        </w:rPr>
+        <w:t xml:space="preserve">Arquivos alterados: </w:t>
+      </w:r>
+      <w:r>
+        <w:t>SignatureRequestController.php, create.blade.php da assinatura, admin.css, ElectronicSignatureTest.php e CHANGELOG.md.</w:t>
+      </w:r>
+    </w:p>
+    <w:p>
+      <w:r>
+        <w:rPr>
+          <w:b/>
+        </w:rPr>
+        <w:t xml:space="preserve">Status atual: </w:t>
+      </w:r>
+      <w:r>
+        <w:t>mudança em validação local para posterior commit, push e publicação no servidor correto rodrigopujaniadvocacia.com.br.</w:t>
+      </w:r>
+    </w:p>
     <w:sectPr>
       <w:headerReference w:type="default" r:id="rId9"/>
       <w:footerReference w:type="default" r:id="rId10"/>

</xml_diff>

<commit_message>
fix: improve template signature workflow
</commit_message>
<xml_diff>
--- a/DOC/Relatorio_Central_Juridica_2026-09-20_corrigido.docx
+++ b/DOC/Relatorio_Central_Juridica_2026-09-20_corrigido.docx
@@ -1788,6 +1788,172 @@
         <w:t>mudança em validação local para posterior commit, push e publicação no servidor correto rodrigopujaniadvocacia.com.br.</w:t>
       </w:r>
     </w:p>
+    <w:p>
+      <w:r>
+        <w:br w:type="page"/>
+      </w:r>
+    </w:p>
+    <w:p>
+      <w:pPr>
+        <w:pStyle w:val="Heading1"/>
+        <w:jc w:val="left"/>
+      </w:pPr>
+      <w:r>
+        <w:t>Atualização 2026-09-22 - Fluxo de modelos para assinatura</w:t>
+      </w:r>
+    </w:p>
+    <w:p>
+      <w:r>
+        <w:rPr>
+          <w:b/>
+        </w:rPr>
+        <w:t xml:space="preserve">Diagnóstico objetivo: </w:t>
+      </w:r>
+      <w:r>
+        <w:t>em produção havia modelo de documento com versão publicada, porém inativo, e nenhum PDF privado gerado elegível para assinatura. Por isso a tela de envio não oferecia documento existente nem modelo ativo e selecionava apenas o anexo manual.</w:t>
+      </w:r>
+    </w:p>
+    <w:p>
+      <w:pPr>
+        <w:pStyle w:val="Heading2"/>
+      </w:pPr>
+      <w:r>
+        <w:t>Correções implementadas</w:t>
+      </w:r>
+    </w:p>
+    <w:p>
+      <w:pPr>
+        <w:pStyle w:val="ListBullet"/>
+      </w:pPr>
+      <w:r>
+        <w:t>A tela de assinatura passou a informar quando existem modelos versionados inativos e orientar a ativação pelo Gerador de documentos.</w:t>
+      </w:r>
+    </w:p>
+    <w:p>
+      <w:pPr>
+        <w:pStyle w:val="ListBullet"/>
+      </w:pPr>
+      <w:r>
+        <w:t>A listagem e os detalhes de modelos ganharam atalhos para testar PDF e enviar para assinatura quando o modelo está ativo e a feature de assinatura está habilitada.</w:t>
+      </w:r>
+    </w:p>
+    <w:p>
+      <w:pPr>
+        <w:pStyle w:val="ListBullet"/>
+      </w:pPr>
+      <w:r>
+        <w:t>Modelos inativos com versão publicada exibem botão seguro de ativação no próprio Gerador de documentos.</w:t>
+      </w:r>
+    </w:p>
+    <w:p>
+      <w:pPr>
+        <w:pStyle w:val="ListBullet"/>
+      </w:pPr>
+      <w:r>
+        <w:t>O fluxo Testar/visualizar PDF gera obrigatoriamente PDF, salva em Documentos e redireciona para conferência antes de qualquer envio ao cliente.</w:t>
+      </w:r>
+    </w:p>
+    <w:p>
+      <w:pPr>
+        <w:pStyle w:val="ListBullet"/>
+      </w:pPr>
+      <w:r>
+        <w:t>O envio por modelo continua gravando documento privado, SHA-256 e evidência antes de criar a solicitação de assinatura.</w:t>
+      </w:r>
+    </w:p>
+    <w:p>
+      <w:pPr>
+        <w:pStyle w:val="Heading2"/>
+      </w:pPr>
+      <w:r>
+        <w:t>Como usar no painel</w:t>
+      </w:r>
+    </w:p>
+    <w:p>
+      <w:pPr>
+        <w:pStyle w:val="ListNumber"/>
+      </w:pPr>
+      <w:r>
+        <w:t>Acesse Jurídico &gt; Gerador de documentos.</w:t>
+      </w:r>
+    </w:p>
+    <w:p>
+      <w:pPr>
+        <w:pStyle w:val="ListNumber"/>
+      </w:pPr>
+      <w:r>
+        <w:t>Se o modelo aparecer como inativo, clique em Ativar modelo.</w:t>
+      </w:r>
+    </w:p>
+    <w:p>
+      <w:pPr>
+        <w:pStyle w:val="ListNumber"/>
+      </w:pPr>
+      <w:r>
+        <w:t>Clique em Testar PDF para gerar uma cópia de conferência em Documentos.</w:t>
+      </w:r>
+    </w:p>
+    <w:p>
+      <w:pPr>
+        <w:pStyle w:val="ListNumber"/>
+      </w:pPr>
+      <w:r>
+        <w:t>Confira o PDF salvo e, se estiver correto, use Enviar para assinatura diretamente no Gerador ou acesse Jurídico &gt; Assinaturas &gt; Nova solicitação.</w:t>
+      </w:r>
+    </w:p>
+    <w:p>
+      <w:pPr>
+        <w:pStyle w:val="ListNumber"/>
+      </w:pPr>
+      <w:r>
+        <w:t>Informe cliente, processo, signatários e envie o convite pelo fluxo normal de assinatura.</w:t>
+      </w:r>
+    </w:p>
+    <w:p>
+      <w:pPr>
+        <w:pStyle w:val="Heading2"/>
+      </w:pPr>
+      <w:r>
+        <w:t>Validações locais da alteração</w:t>
+      </w:r>
+    </w:p>
+    <w:p>
+      <w:pPr>
+        <w:pStyle w:val="ListBullet"/>
+      </w:pPr>
+      <w:r>
+        <w:t>Testes específicos do Gerador de documentos, assinatura eletrônica e codificação de textos aprovados.</w:t>
+      </w:r>
+    </w:p>
+    <w:p>
+      <w:pPr>
+        <w:pStyle w:val="ListBullet"/>
+      </w:pPr>
+      <w:r>
+        <w:t>Lint PHP aprovado nos controllers e views alterados.</w:t>
+      </w:r>
+    </w:p>
+    <w:p>
+      <w:pPr>
+        <w:pStyle w:val="ListBullet"/>
+      </w:pPr>
+      <w:r>
+        <w:t>Textos gravados em UTF-8 sem BOM e sem mojibake intencional.</w:t>
+      </w:r>
+    </w:p>
+    <w:p>
+      <w:pPr>
+        <w:pStyle w:val="Heading2"/>
+      </w:pPr>
+      <w:r>
+        <w:t>Observação operacional</w:t>
+      </w:r>
+    </w:p>
+    <w:p>
+      <w:r>
+        <w:t>A correção não ativa automaticamente modelos reais nem altera dados de clientes. A ativação fica disponível no painel para decisão operacional do escritório.</w:t>
+      </w:r>
+    </w:p>
     <w:sectPr>
       <w:headerReference w:type="default" r:id="rId9"/>
       <w:footerReference w:type="default" r:id="rId10"/>

</xml_diff>